<commit_message>
Enhance portfolio with improved SEO, accessibility, and performance features
- Updated meta tags in index.html for better SEO and social media sharing.
- Refactored App component to lazy load sections for improved performance.
- Added loading screen and skip-to-content functionality for better accessibility.
- Enhanced Header component with keyboard navigation support and improved menu handling.
- Updated ProjectsSection to include card flip functionality and improved styling.
- Refactored TechStacksSection for better layout and responsiveness.
- Updated package.json for versioning and added new scripts for testing and analysis.
- Improved TypeScript configurations and ESLint rules for better code quality.
</commit_message>
<xml_diff>
--- a/public/documents/Mohamed H. Aly.docx
+++ b/public/documents/Mohamed H. Aly.docx
@@ -41,24 +41,30 @@
           <w:u w:val="single"/>
         </w:rPr>
       </w:pPr>
-      <w:r>
-        <w:fldChar w:fldCharType="begin"/>
-      </w:r>
-      <w:r>
-        <w:instrText>HYPERLINK "https://metwesh.github.io/portfolio/"</w:instrText>
-      </w:r>
-      <w:r>
-        <w:fldChar w:fldCharType="separate"/>
-      </w:r>
-      <w:r>
+      <w:hyperlink r:id="rId9" w:history="1">
+        <w:r>
+          <w:rPr>
+            <w:u w:val="single"/>
+          </w:rPr>
+          <w:t>Portfolio website</w:t>
+        </w:r>
+      </w:hyperlink>
+    </w:p>
+    <w:p>
+      <w:pPr>
+        <w:pStyle w:val="Email"/>
         <w:rPr>
           <w:u w:val="single"/>
         </w:rPr>
-        <w:t>Portfolio website</w:t>
-      </w:r>
-      <w:r>
-        <w:fldChar w:fldCharType="end"/>
-      </w:r>
+      </w:pPr>
+      <w:hyperlink r:id="rId10" w:history="1">
+        <w:r>
+          <w:rPr>
+            <w:u w:val="single"/>
+          </w:rPr>
+          <w:t>LinkedIn profile</w:t>
+        </w:r>
+      </w:hyperlink>
     </w:p>
     <w:p>
       <w:pPr>
@@ -67,33 +73,7 @@
           <w:u w:val="single"/>
         </w:rPr>
       </w:pPr>
-      <w:r>
-        <w:fldChar w:fldCharType="begin"/>
-      </w:r>
-      <w:r>
-        <w:instrText>HYPERLINK "https://www.linkedin.com/in/mohamed-h-aly/"</w:instrText>
-      </w:r>
-      <w:r>
-        <w:fldChar w:fldCharType="separate"/>
-      </w:r>
-      <w:r>
-        <w:rPr>
-          <w:u w:val="single"/>
-        </w:rPr>
-        <w:t>LinkedIn profile</w:t>
-      </w:r>
-      <w:r>
-        <w:fldChar w:fldCharType="end"/>
-      </w:r>
-    </w:p>
-    <w:p>
-      <w:pPr>
-        <w:pStyle w:val="Email"/>
-        <w:rPr>
-          <w:u w:val="single"/>
-        </w:rPr>
-      </w:pPr>
-      <w:hyperlink r:id="rId9" w:history="1">
+      <w:hyperlink r:id="rId11" w:history="1">
         <w:r>
           <w:rPr>
             <w:u w:val="single"/>
@@ -155,17 +135,17 @@
         <w:tblLook w:val="04A0" w:firstRow="1" w:lastRow="0" w:firstColumn="1" w:lastColumn="0" w:noHBand="0" w:noVBand="1"/>
       </w:tblPr>
       <w:tblGrid>
-        <w:gridCol w:w="5035"/>
-        <w:gridCol w:w="5035"/>
+        <w:gridCol w:w="5386"/>
+        <w:gridCol w:w="5386"/>
       </w:tblGrid>
       <w:tr>
         <w:tc>
           <w:tcPr>
-            <w:tcW w:w="5035" w:type="dxa"/>
+            <w:tcW w:w="5386" w:type="dxa"/>
           </w:tcPr>
           <w:p>
             <w:pPr>
-              <w:ind w:right="1440"/>
+              <w:ind w:right="283"/>
               <w:rPr>
                 <w:color w:val="404040" w:themeColor="text1" w:themeTint="BF"/>
                 <w:kern w:val="20"/>
@@ -186,7 +166,7 @@
         </w:tc>
         <w:tc>
           <w:tcPr>
-            <w:tcW w:w="5035" w:type="dxa"/>
+            <w:tcW w:w="5386" w:type="dxa"/>
           </w:tcPr>
           <w:p>
             <w:pPr>
@@ -337,7 +317,7 @@
     <w:tbl>
       <w:tblPr>
         <w:tblStyle w:val="TableGrid"/>
-        <w:tblW w:w="0" w:type="auto"/>
+        <w:tblW w:w="10773" w:type="dxa"/>
         <w:tblBorders>
           <w:top w:val="none" w:sz="0" w:space="0" w:color="auto"/>
           <w:left w:val="none" w:sz="0" w:space="0" w:color="auto"/>
@@ -352,17 +332,17 @@
         <w:tblLook w:val="04A0" w:firstRow="1" w:lastRow="0" w:firstColumn="1" w:lastColumn="0" w:noHBand="0" w:noVBand="1"/>
       </w:tblPr>
       <w:tblGrid>
-        <w:gridCol w:w="5035"/>
-        <w:gridCol w:w="5035"/>
+        <w:gridCol w:w="5386"/>
+        <w:gridCol w:w="5387"/>
       </w:tblGrid>
       <w:tr>
         <w:tc>
           <w:tcPr>
-            <w:tcW w:w="5035" w:type="dxa"/>
+            <w:tcW w:w="5386" w:type="dxa"/>
           </w:tcPr>
           <w:p>
             <w:pPr>
-              <w:ind w:right="1440"/>
+              <w:ind w:right="283"/>
               <w:rPr>
                 <w:color w:val="404040" w:themeColor="text1" w:themeTint="BF"/>
                 <w:kern w:val="20"/>
@@ -383,7 +363,7 @@
         </w:tc>
         <w:tc>
           <w:tcPr>
-            <w:tcW w:w="5035" w:type="dxa"/>
+            <w:tcW w:w="5387" w:type="dxa"/>
           </w:tcPr>
           <w:p>
             <w:pPr>
@@ -608,17 +588,17 @@
         <w:tblLook w:val="04A0" w:firstRow="1" w:lastRow="0" w:firstColumn="1" w:lastColumn="0" w:noHBand="0" w:noVBand="1"/>
       </w:tblPr>
       <w:tblGrid>
-        <w:gridCol w:w="5035"/>
-        <w:gridCol w:w="5035"/>
+        <w:gridCol w:w="5386"/>
+        <w:gridCol w:w="5387"/>
       </w:tblGrid>
       <w:tr>
         <w:tc>
           <w:tcPr>
-            <w:tcW w:w="5035" w:type="dxa"/>
+            <w:tcW w:w="5386" w:type="dxa"/>
           </w:tcPr>
           <w:p>
             <w:pPr>
-              <w:ind w:right="1440"/>
+              <w:ind w:right="283"/>
               <w:rPr>
                 <w:color w:val="404040" w:themeColor="text1" w:themeTint="BF"/>
                 <w:kern w:val="20"/>
@@ -639,7 +619,7 @@
         </w:tc>
         <w:tc>
           <w:tcPr>
-            <w:tcW w:w="5035" w:type="dxa"/>
+            <w:tcW w:w="5387" w:type="dxa"/>
           </w:tcPr>
           <w:p>
             <w:pPr>
@@ -853,17 +833,17 @@
         <w:tblLook w:val="04A0" w:firstRow="1" w:lastRow="0" w:firstColumn="1" w:lastColumn="0" w:noHBand="0" w:noVBand="1"/>
       </w:tblPr>
       <w:tblGrid>
-        <w:gridCol w:w="5035"/>
-        <w:gridCol w:w="5035"/>
+        <w:gridCol w:w="5386"/>
+        <w:gridCol w:w="5387"/>
       </w:tblGrid>
       <w:tr>
         <w:tc>
           <w:tcPr>
-            <w:tcW w:w="5035" w:type="dxa"/>
+            <w:tcW w:w="5386" w:type="dxa"/>
           </w:tcPr>
           <w:p>
             <w:pPr>
-              <w:ind w:right="1440"/>
+              <w:ind w:right="283"/>
               <w:rPr>
                 <w:color w:val="404040" w:themeColor="text1" w:themeTint="BF"/>
                 <w:kern w:val="20"/>
@@ -884,7 +864,7 @@
         </w:tc>
         <w:tc>
           <w:tcPr>
-            <w:tcW w:w="5035" w:type="dxa"/>
+            <w:tcW w:w="5387" w:type="dxa"/>
           </w:tcPr>
           <w:p>
             <w:pPr>
@@ -1092,17 +1072,17 @@
         <w:tblLook w:val="04A0" w:firstRow="1" w:lastRow="0" w:firstColumn="1" w:lastColumn="0" w:noHBand="0" w:noVBand="1"/>
       </w:tblPr>
       <w:tblGrid>
-        <w:gridCol w:w="5035"/>
-        <w:gridCol w:w="5035"/>
+        <w:gridCol w:w="5386"/>
+        <w:gridCol w:w="5387"/>
       </w:tblGrid>
       <w:tr>
         <w:tc>
           <w:tcPr>
-            <w:tcW w:w="5035" w:type="dxa"/>
+            <w:tcW w:w="5386" w:type="dxa"/>
           </w:tcPr>
           <w:p>
             <w:pPr>
-              <w:ind w:right="1440"/>
+              <w:ind w:right="283"/>
               <w:rPr>
                 <w:color w:val="404040" w:themeColor="text1" w:themeTint="BF"/>
                 <w:kern w:val="20"/>
@@ -1123,7 +1103,7 @@
         </w:tc>
         <w:tc>
           <w:tcPr>
-            <w:tcW w:w="5035" w:type="dxa"/>
+            <w:tcW w:w="5387" w:type="dxa"/>
           </w:tcPr>
           <w:p>
             <w:pPr>
@@ -1731,12 +1711,9 @@
         <w:pStyle w:val="ResumeText"/>
       </w:pPr>
       <w:r>
-        <w:t>Projects and certifications available in my</w:t>
-      </w:r>
-      <w:r>
-        <w:t xml:space="preserve"> </w:t>
-      </w:r>
-      <w:hyperlink r:id="rId10" w:history="1">
+        <w:t xml:space="preserve">Projects and certifications available in my </w:t>
+      </w:r>
+      <w:hyperlink r:id="rId12" w:history="1">
         <w:r>
           <w:rPr>
             <w:rStyle w:val="Hyperlink"/>
@@ -1750,7 +1727,7 @@
       </w:r>
     </w:p>
     <w:sectPr>
-      <w:footerReference w:type="default" r:id="rId11"/>
+      <w:footerReference w:type="default" r:id="rId13"/>
       <w:pgSz w:w="12240" w:h="15840" w:code="1"/>
       <w:pgMar w:top="720" w:right="720" w:bottom="720" w:left="720" w:header="720" w:footer="720" w:gutter="0"/>
       <w:pgNumType w:start="1"/>
@@ -3917,6 +3894,7 @@
   <w:style w:type="character" w:default="1" w:styleId="DefaultParagraphFont">
     <w:name w:val="Default Paragraph Font"/>
     <w:uiPriority w:val="1"/>
+    <w:semiHidden/>
     <w:unhideWhenUsed/>
   </w:style>
   <w:style w:type="table" w:default="1" w:styleId="TableNormal">

</xml_diff>

<commit_message>
feat: update documents with new versions of Mohamed H. Aly's files
</commit_message>
<xml_diff>
--- a/public/documents/Mohamed H. Aly.docx
+++ b/public/documents/Mohamed H. Aly.docx
@@ -1,21 +1,16 @@
 
 <file path=word/document.xml><?xml version="1.0" encoding="utf-8"?>
-<w:document xmlns:wpc="http://schemas.microsoft.com/office/word/2010/wordprocessingCanvas" xmlns:cx="http://schemas.microsoft.com/office/drawing/2014/chartex" xmlns:cx1="http://schemas.microsoft.com/office/drawing/2015/9/8/chartex" xmlns:cx2="http://schemas.microsoft.com/office/drawing/2015/10/21/chartex" xmlns:cx3="http://schemas.microsoft.com/office/drawing/2016/5/9/chartex" xmlns:cx4="http://schemas.microsoft.com/office/drawing/2016/5/10/chartex" xmlns:cx5="http://schemas.microsoft.com/office/drawing/2016/5/11/chartex" xmlns:cx6="http://schemas.microsoft.com/office/drawing/2016/5/12/chartex" xmlns:cx7="http://schemas.microsoft.com/office/drawing/2016/5/13/chartex" xmlns:cx8="http://schemas.microsoft.com/office/drawing/2016/5/14/chartex" xmlns:mc="http://schemas.openxmlformats.org/markup-compatibility/2006" xmlns:aink="http://schemas.microsoft.com/office/drawing/2016/ink" xmlns:am3d="http://schemas.microsoft.com/office/drawing/2017/model3d" xmlns:o="urn:schemas-microsoft-com:office:office" xmlns:oel="http://schemas.microsoft.com/office/2019/extlst" xmlns:r="http://schemas.openxmlformats.org/officeDocument/2006/relationships" xmlns:m="http://schemas.openxmlformats.org/officeDocument/2006/math" xmlns:v="urn:schemas-microsoft-com:vml" xmlns:wp14="http://schemas.microsoft.com/office/word/2010/wordprocessingDrawing" xmlns:wp="http://schemas.openxmlformats.org/drawingml/2006/wordprocessingDrawing" xmlns:w10="urn:schemas-microsoft-com:office:word" xmlns:w="http://schemas.openxmlformats.org/wordprocessingml/2006/main" xmlns:w14="http://schemas.microsoft.com/office/word/2010/wordml" xmlns:w15="http://schemas.microsoft.com/office/word/2012/wordml" xmlns:w16cex="http://schemas.microsoft.com/office/word/2018/wordml/cex" xmlns:w16cid="http://schemas.microsoft.com/office/word/2016/wordml/cid" xmlns:w16="http://schemas.microsoft.com/office/word/2018/wordml" xmlns:w16du="http://schemas.microsoft.com/office/word/2023/wordml/word16du" xmlns:w16sdtdh="http://schemas.microsoft.com/office/word/2020/wordml/sdtdatahash" xmlns:w16sdtfl="http://schemas.microsoft.com/office/word/2024/wordml/sdtformatlock" xmlns:w16se="http://schemas.microsoft.com/office/word/2015/wordml/symex" xmlns:wpg="http://schemas.microsoft.com/office/word/2010/wordprocessingGroup" xmlns:wpi="http://schemas.microsoft.com/office/word/2010/wordprocessingInk" xmlns:wne="http://schemas.microsoft.com/office/word/2006/wordml" xmlns:wps="http://schemas.microsoft.com/office/word/2010/wordprocessingShape" mc:Ignorable="w14 w15 w16se w16cid w16 w16cex w16sdtdh w16sdtfl w16du wp14">
+<w:document xmlns:wpc="http://schemas.microsoft.com/office/word/2010/wordprocessingCanvas" xmlns:cx="http://schemas.microsoft.com/office/drawing/2014/chartex" xmlns:cx1="http://schemas.microsoft.com/office/drawing/2015/9/8/chartex" xmlns:cx2="http://schemas.microsoft.com/office/drawing/2015/10/21/chartex" xmlns:cx3="http://schemas.microsoft.com/office/drawing/2016/5/9/chartex" xmlns:cx4="http://schemas.microsoft.com/office/drawing/2016/5/10/chartex" xmlns:cx5="http://schemas.microsoft.com/office/drawing/2016/5/11/chartex" xmlns:cx6="http://schemas.microsoft.com/office/drawing/2016/5/12/chartex" xmlns:cx7="http://schemas.microsoft.com/office/drawing/2016/5/13/chartex" xmlns:cx8="http://schemas.microsoft.com/office/drawing/2016/5/14/chartex" xmlns:mc="http://schemas.openxmlformats.org/markup-compatibility/2006" xmlns:m="http://schemas.openxmlformats.org/officeDocument/2006/math" xmlns:aink="http://schemas.microsoft.com/office/drawing/2016/ink" xmlns:am3d="http://schemas.microsoft.com/office/drawing/2017/model3d" xmlns:oel="http://schemas.microsoft.com/office/2019/extlst" xmlns:r="http://schemas.openxmlformats.org/officeDocument/2006/relationships" xmlns:wp14="http://schemas.microsoft.com/office/word/2010/wordprocessingDrawing" xmlns:wp="http://schemas.openxmlformats.org/drawingml/2006/wordprocessingDrawing" xmlns:wpg="http://schemas.microsoft.com/office/word/2010/wordprocessingGroup" xmlns:wpi="http://schemas.microsoft.com/office/word/2010/wordprocessingInk" xmlns:wps="http://schemas.microsoft.com/office/word/2010/wordprocessingShape" xmlns:o="urn:schemas-microsoft-com:office:office" xmlns:v="urn:schemas-microsoft-com:vml" xmlns:w10="urn:schemas-microsoft-com:office:word" xmlns:w="http://schemas.openxmlformats.org/wordprocessingml/2006/main" xmlns:w14="http://schemas.microsoft.com/office/word/2010/wordml" xmlns:w15="http://schemas.microsoft.com/office/word/2012/wordml" xmlns:w16cei="http://schemas.microsoft.com/office/word/2026/wordml/cei" xmlns:w16cex="http://schemas.microsoft.com/office/word/2018/wordml/cex" xmlns:w16cid="http://schemas.microsoft.com/office/word/2016/wordml/cid" xmlns:w16="http://schemas.microsoft.com/office/word/2018/wordml" xmlns:w16sdtdh="http://schemas.microsoft.com/office/word/2020/wordml/sdtdatahash" xmlns:w16sdtfl="http://schemas.microsoft.com/office/word/2024/wordml/sdtformatlock" xmlns:w16se="http://schemas.microsoft.com/office/word/2015/wordml/symex" xmlns:w16du="http://schemas.microsoft.com/office/word/2023/wordml/word16du" xmlns:wne="http://schemas.microsoft.com/office/word/2006/wordml" mc:Ignorable="w14 w15 w16se w16cid w16 w16cex w16sdtdh w16sdtfl w16du wp14">
   <w:body>
     <w:p>
       <w:pPr>
         <w:pStyle w:val="ContactInfo"/>
       </w:pPr>
       <w:r>
-        <w:t xml:space="preserve">213, Street 8, 2nd district, 1st area </w:t>
-      </w:r>
-    </w:p>
-    <w:p>
-      <w:pPr>
-        <w:pStyle w:val="ContactInfo"/>
-      </w:pPr>
-      <w:r>
-        <w:t>New Cairo, 11835 Cairo</w:t>
+        <w:t>New Cairo, Cairo</w:t>
+      </w:r>
+      <w:r>
+        <w:t>, Egypt</w:t>
       </w:r>
     </w:p>
     <w:p>
@@ -99,6 +94,258 @@
       </w:pPr>
       <w:r>
         <w:t>Experience</w:t>
+      </w:r>
+    </w:p>
+    <w:p>
+      <w:pPr>
+        <w:pStyle w:val="Heading2"/>
+        <w:rPr>
+          <w:sz w:val="21"/>
+          <w:szCs w:val="21"/>
+        </w:rPr>
+      </w:pPr>
+      <w:r>
+        <w:rPr>
+          <w:sz w:val="21"/>
+          <w:szCs w:val="21"/>
+        </w:rPr>
+        <w:t>E&amp; (Etisalat UAE)</w:t>
+      </w:r>
+    </w:p>
+    <w:tbl>
+      <w:tblPr>
+        <w:tblStyle w:val="TableGrid"/>
+        <w:tblW w:w="0" w:type="auto"/>
+        <w:tblBorders>
+          <w:top w:val="none" w:sz="0" w:space="0" w:color="auto"/>
+          <w:left w:val="none" w:sz="0" w:space="0" w:color="auto"/>
+          <w:bottom w:val="none" w:sz="0" w:space="0" w:color="auto"/>
+          <w:right w:val="none" w:sz="0" w:space="0" w:color="auto"/>
+          <w:insideH w:val="none" w:sz="0" w:space="0" w:color="auto"/>
+          <w:insideV w:val="none" w:sz="0" w:space="0" w:color="auto"/>
+        </w:tblBorders>
+        <w:tblCellMar>
+          <w:left w:w="0" w:type="dxa"/>
+        </w:tblCellMar>
+        <w:tblLook w:val="04A0" w:firstRow="1" w:lastRow="0" w:firstColumn="1" w:lastColumn="0" w:noHBand="0" w:noVBand="1"/>
+      </w:tblPr>
+      <w:tblGrid>
+        <w:gridCol w:w="5386"/>
+        <w:gridCol w:w="5386"/>
+      </w:tblGrid>
+      <w:tr>
+        <w:tc>
+          <w:tcPr>
+            <w:tcW w:w="5386" w:type="dxa"/>
+          </w:tcPr>
+          <w:p>
+            <w:pPr>
+              <w:ind w:right="283"/>
+              <w:rPr>
+                <w:color w:val="404040" w:themeColor="text1" w:themeTint="BF"/>
+                <w:kern w:val="20"/>
+                <w:sz w:val="21"/>
+                <w:szCs w:val="21"/>
+              </w:rPr>
+            </w:pPr>
+            <w:r>
+              <w:rPr>
+                <w:color w:val="404040" w:themeColor="text1" w:themeTint="BF"/>
+                <w:kern w:val="20"/>
+                <w:sz w:val="21"/>
+                <w:szCs w:val="21"/>
+              </w:rPr>
+              <w:t>Senior Software</w:t>
+            </w:r>
+            <w:r>
+              <w:rPr>
+                <w:color w:val="404040" w:themeColor="text1" w:themeTint="BF"/>
+                <w:kern w:val="20"/>
+                <w:sz w:val="21"/>
+                <w:szCs w:val="21"/>
+              </w:rPr>
+              <w:t xml:space="preserve"> </w:t>
+            </w:r>
+            <w:r>
+              <w:rPr>
+                <w:color w:val="404040" w:themeColor="text1" w:themeTint="BF"/>
+                <w:kern w:val="20"/>
+                <w:sz w:val="21"/>
+                <w:szCs w:val="21"/>
+              </w:rPr>
+              <w:t>Developer</w:t>
+            </w:r>
+          </w:p>
+        </w:tc>
+        <w:tc>
+          <w:tcPr>
+            <w:tcW w:w="5386" w:type="dxa"/>
+          </w:tcPr>
+          <w:p>
+            <w:pPr>
+              <w:pStyle w:val="ResumeText"/>
+              <w:spacing w:after="0"/>
+              <w:ind w:right="283"/>
+              <w:jc w:val="right"/>
+            </w:pPr>
+            <w:r>
+              <w:t>Dec</w:t>
+            </w:r>
+            <w:r>
+              <w:t xml:space="preserve"> 202</w:t>
+            </w:r>
+            <w:r>
+              <w:t>5</w:t>
+            </w:r>
+            <w:r>
+              <w:t xml:space="preserve"> - Present</w:t>
+            </w:r>
+          </w:p>
+        </w:tc>
+      </w:tr>
+    </w:tbl>
+    <w:p>
+      <w:pPr>
+        <w:pStyle w:val="Heading2"/>
+        <w:numPr>
+          <w:ilvl w:val="0"/>
+          <w:numId w:val="13"/>
+        </w:numPr>
+        <w:rPr>
+          <w:rFonts w:asciiTheme="minorHAnsi" w:eastAsiaTheme="minorHAnsi" w:hAnsiTheme="minorHAnsi" w:cstheme="minorBidi"/>
+          <w:b w:val="0"/>
+          <w:bCs w:val="0"/>
+          <w:caps w:val="0"/>
+          <w:color w:val="595959" w:themeColor="text1" w:themeTint="A6"/>
+          <w14:ligatures w14:val="none"/>
+        </w:rPr>
+      </w:pPr>
+      <w:r>
+        <w:rPr>
+          <w:rFonts w:eastAsiaTheme="minorHAnsi"/>
+          <w:color w:val="595959" w:themeColor="text1" w:themeTint="A6"/>
+          <w:lang w:val="en-EG"/>
+        </w:rPr>
+        <w:t xml:space="preserve">Portal modernization: </w:t>
+      </w:r>
+      <w:r>
+        <w:rPr>
+          <w:rFonts w:asciiTheme="minorHAnsi" w:eastAsiaTheme="minorHAnsi" w:hAnsiTheme="minorHAnsi" w:cstheme="minorBidi"/>
+          <w:b w:val="0"/>
+          <w:bCs w:val="0"/>
+          <w:caps w:val="0"/>
+          <w:color w:val="595959" w:themeColor="text1" w:themeTint="A6"/>
+          <w14:ligatures w14:val="none"/>
+        </w:rPr>
+        <w:t>Led migration of a 15-year-old Java Server Faces CIM portal to React with micro-frontend architecture, each module backed by a dedicated BFF microservice.</w:t>
+      </w:r>
+    </w:p>
+    <w:p>
+      <w:pPr>
+        <w:pStyle w:val="Heading2"/>
+        <w:numPr>
+          <w:ilvl w:val="0"/>
+          <w:numId w:val="13"/>
+        </w:numPr>
+        <w:rPr>
+          <w:rFonts w:asciiTheme="minorHAnsi" w:eastAsiaTheme="minorHAnsi" w:hAnsiTheme="minorHAnsi" w:cstheme="minorBidi"/>
+          <w:b w:val="0"/>
+          <w:bCs w:val="0"/>
+          <w:caps w:val="0"/>
+          <w:color w:val="595959" w:themeColor="text1" w:themeTint="A6"/>
+          <w14:ligatures w14:val="none"/>
+        </w:rPr>
+      </w:pPr>
+      <w:r>
+        <w:rPr>
+          <w:rFonts w:eastAsiaTheme="minorHAnsi"/>
+          <w:color w:val="595959" w:themeColor="text1" w:themeTint="A6"/>
+          <w:lang w:val="en-EG"/>
+        </w:rPr>
+        <w:t xml:space="preserve">Component library overhaul: </w:t>
+      </w:r>
+      <w:r>
+        <w:rPr>
+          <w:rFonts w:asciiTheme="minorHAnsi" w:eastAsiaTheme="minorHAnsi" w:hAnsiTheme="minorHAnsi" w:cstheme="minorBidi"/>
+          <w:b w:val="0"/>
+          <w:bCs w:val="0"/>
+          <w:caps w:val="0"/>
+          <w:color w:val="595959" w:themeColor="text1" w:themeTint="A6"/>
+          <w14:ligatures w14:val="none"/>
+        </w:rPr>
+        <w:t>Shrunk a bloated internal component library from 50 MB to under 5 MB by eliminating redundancy and dead code, preserving 100% of original functionality.</w:t>
+      </w:r>
+    </w:p>
+    <w:p>
+      <w:pPr>
+        <w:pStyle w:val="Heading2"/>
+        <w:numPr>
+          <w:ilvl w:val="0"/>
+          <w:numId w:val="13"/>
+        </w:numPr>
+        <w:rPr>
+          <w:rFonts w:asciiTheme="minorHAnsi" w:eastAsiaTheme="minorHAnsi" w:hAnsiTheme="minorHAnsi" w:cstheme="minorBidi"/>
+          <w:b w:val="0"/>
+          <w:bCs w:val="0"/>
+          <w:caps w:val="0"/>
+          <w:color w:val="595959" w:themeColor="text1" w:themeTint="A6"/>
+          <w14:ligatures w14:val="none"/>
+        </w:rPr>
+      </w:pPr>
+      <w:r>
+        <w:rPr>
+          <w:rFonts w:eastAsiaTheme="minorHAnsi"/>
+          <w:color w:val="595959" w:themeColor="text1" w:themeTint="A6"/>
+          <w:lang w:val="en-EG"/>
+        </w:rPr>
+        <w:t xml:space="preserve">Algorithm optimization: </w:t>
+      </w:r>
+      <w:r>
+        <w:rPr>
+          <w:rFonts w:asciiTheme="minorHAnsi" w:eastAsiaTheme="minorHAnsi" w:hAnsiTheme="minorHAnsi" w:cstheme="minorBidi"/>
+          <w:b w:val="0"/>
+          <w:bCs w:val="0"/>
+          <w:caps w:val="0"/>
+          <w:color w:val="595959" w:themeColor="text1" w:themeTint="A6"/>
+          <w14:ligatures w14:val="none"/>
+        </w:rPr>
+        <w:t>Optimized cell selection logic from O(n) to O(1), replacing linear scans with direct index lookups in interactive data grids.</w:t>
+      </w:r>
+    </w:p>
+    <w:p>
+      <w:pPr>
+        <w:pStyle w:val="Heading2"/>
+        <w:numPr>
+          <w:ilvl w:val="0"/>
+          <w:numId w:val="13"/>
+        </w:numPr>
+        <w:rPr>
+          <w:rFonts w:asciiTheme="minorHAnsi" w:eastAsiaTheme="minorHAnsi" w:hAnsiTheme="minorHAnsi" w:cstheme="minorBidi"/>
+          <w:b w:val="0"/>
+          <w:bCs w:val="0"/>
+          <w:caps w:val="0"/>
+          <w:color w:val="595959" w:themeColor="text1" w:themeTint="A6"/>
+          <w14:ligatures w14:val="none"/>
+        </w:rPr>
+      </w:pPr>
+      <w:r>
+        <w:rPr>
+          <w:rFonts w:eastAsiaTheme="minorHAnsi"/>
+          <w:color w:val="595959" w:themeColor="text1" w:themeTint="A6"/>
+          <w:lang w:val="en-EG"/>
+        </w:rPr>
+        <w:t xml:space="preserve">Technical leadership: </w:t>
+      </w:r>
+      <w:r>
+        <w:rPr>
+          <w:rFonts w:asciiTheme="minorHAnsi" w:eastAsiaTheme="minorHAnsi" w:hAnsiTheme="minorHAnsi" w:cstheme="minorBidi"/>
+          <w:b w:val="0"/>
+          <w:bCs w:val="0"/>
+          <w:caps w:val="0"/>
+          <w:color w:val="595959" w:themeColor="text1" w:themeTint="A6"/>
+          <w14:ligatures w14:val="none"/>
+        </w:rPr>
+        <w:t>Drove React adoption within a team transitioning from a legacy JSF codebase, establishing patterns and standards that accelerated delivery across all micro-frontend modules.</w:t>
       </w:r>
     </w:p>
     <w:p>
@@ -176,7 +423,16 @@
               <w:jc w:val="right"/>
             </w:pPr>
             <w:r>
-              <w:t>Nov 2024 - Present</w:t>
+              <w:t xml:space="preserve">Nov 2024 </w:t>
+            </w:r>
+            <w:r>
+              <w:t>–</w:t>
+            </w:r>
+            <w:r>
+              <w:t xml:space="preserve"> </w:t>
+            </w:r>
+            <w:r>
+              <w:t>Dec 2025</w:t>
             </w:r>
           </w:p>
         </w:tc>
@@ -292,10 +548,18 @@
           <w:bCs/>
           <w:lang w:val="en-EG"/>
         </w:rPr>
-        <w:t xml:space="preserve">Cross-functional collaboration: </w:t>
-      </w:r>
-      <w:r>
-        <w:t>Worked closely with designers and backend teams to ensure seamless UI/UX and reliable system integration.</w:t>
+        <w:t>Adaptability</w:t>
+      </w:r>
+      <w:r>
+        <w:rPr>
+          <w:b/>
+          <w:bCs/>
+          <w:lang w:val="en-EG"/>
+        </w:rPr>
+        <w:t xml:space="preserve">: </w:t>
+      </w:r>
+      <w:r>
+        <w:t>Legacy modernization: Maintained and extended a legacy Vue.js codebase, refactoring outdated patterns and ensuring seamless integration with modern backend services.</w:t>
       </w:r>
     </w:p>
     <w:p>
@@ -812,6 +1076,7 @@
           <w:sz w:val="21"/>
           <w:szCs w:val="21"/>
         </w:rPr>
+        <w:lastRenderedPageBreak/>
         <w:t>Advanced Computer Technologies (ACT)</w:t>
       </w:r>
     </w:p>
@@ -1050,7 +1315,6 @@
           <w:sz w:val="21"/>
           <w:szCs w:val="21"/>
         </w:rPr>
-        <w:lastRenderedPageBreak/>
         <w:t>self-employed</w:t>
       </w:r>
     </w:p>
@@ -1138,8 +1402,6 @@
         <w:ind w:right="283"/>
         <w:rPr>
           <w:rFonts w:eastAsiaTheme="minorHAnsi"/>
-          <w:b/>
-          <w:bCs/>
           <w:color w:val="595959" w:themeColor="text1" w:themeTint="A6"/>
           <w:kern w:val="20"/>
           <w:sz w:val="20"/>
@@ -1156,7 +1418,17 @@
           <w:sz w:val="20"/>
           <w:szCs w:val="20"/>
         </w:rPr>
-        <w:t>Payment Dashboard: Aman Accept Dashboard (Next.js) — a payment operations and analytics tool.</w:t>
+        <w:t xml:space="preserve">Payment Dashboard: </w:t>
+      </w:r>
+      <w:r>
+        <w:rPr>
+          <w:rFonts w:eastAsiaTheme="minorHAnsi"/>
+          <w:color w:val="595959" w:themeColor="text1" w:themeTint="A6"/>
+          <w:kern w:val="20"/>
+          <w:sz w:val="20"/>
+          <w:szCs w:val="20"/>
+        </w:rPr>
+        <w:t>Aman Accept Dashboard (Next.js) — a payment operations and analytics tool.</w:t>
       </w:r>
     </w:p>
     <w:p>
@@ -1187,7 +1459,17 @@
           <w:sz w:val="20"/>
           <w:szCs w:val="20"/>
         </w:rPr>
-        <w:t>Corporate Website: Beltone Company Website (Next.js) — SEO-optimized and performance-driven.</w:t>
+        <w:t xml:space="preserve">Corporate Website: </w:t>
+      </w:r>
+      <w:r>
+        <w:rPr>
+          <w:rFonts w:eastAsiaTheme="minorHAnsi"/>
+          <w:color w:val="595959" w:themeColor="text1" w:themeTint="A6"/>
+          <w:kern w:val="20"/>
+          <w:sz w:val="20"/>
+          <w:szCs w:val="20"/>
+        </w:rPr>
+        <w:t>Beltone Company Website (Next.js) — SEO-optimized and performance-driven.</w:t>
       </w:r>
     </w:p>
     <w:p>
@@ -1200,8 +1482,6 @@
         <w:ind w:right="283"/>
         <w:rPr>
           <w:rFonts w:eastAsiaTheme="minorHAnsi"/>
-          <w:b/>
-          <w:bCs/>
           <w:color w:val="595959" w:themeColor="text1" w:themeTint="A6"/>
           <w:kern w:val="20"/>
           <w:sz w:val="20"/>
@@ -1218,7 +1498,17 @@
           <w:sz w:val="20"/>
           <w:szCs w:val="20"/>
         </w:rPr>
-        <w:t>Blockchain E-commerce: D’art Space (Angular + crypto) — a blockchain-based art e-commerce platform.</w:t>
+        <w:t xml:space="preserve">Blockchain E-commerce: </w:t>
+      </w:r>
+      <w:r>
+        <w:rPr>
+          <w:rFonts w:eastAsiaTheme="minorHAnsi"/>
+          <w:color w:val="595959" w:themeColor="text1" w:themeTint="A6"/>
+          <w:kern w:val="20"/>
+          <w:sz w:val="20"/>
+          <w:szCs w:val="20"/>
+        </w:rPr>
+        <w:t>D’art Space (Angular + crypto) — a blockchain-based art e-commerce platform.</w:t>
       </w:r>
     </w:p>
     <w:p>
@@ -1247,63 +1537,17 @@
           <w:sz w:val="20"/>
           <w:szCs w:val="20"/>
         </w:rPr>
-        <w:t>T</w:t>
+        <w:t xml:space="preserve">CRM Platform: </w:t>
       </w:r>
       <w:r>
         <w:rPr>
           <w:rFonts w:eastAsiaTheme="minorHAnsi"/>
-          <w:b/>
-          <w:bCs/>
           <w:color w:val="595959" w:themeColor="text1" w:themeTint="A6"/>
           <w:kern w:val="20"/>
           <w:sz w:val="20"/>
           <w:szCs w:val="20"/>
         </w:rPr>
-        <w:t>ime</w:t>
-      </w:r>
-      <w:r>
-        <w:rPr>
-          <w:rFonts w:eastAsiaTheme="minorHAnsi"/>
-          <w:b/>
-          <w:bCs/>
-          <w:color w:val="595959" w:themeColor="text1" w:themeTint="A6"/>
-          <w:kern w:val="20"/>
-          <w:sz w:val="20"/>
-          <w:szCs w:val="20"/>
-        </w:rPr>
-        <w:t>ly</w:t>
-      </w:r>
-      <w:r>
-        <w:rPr>
-          <w:rFonts w:eastAsiaTheme="minorHAnsi"/>
-          <w:b/>
-          <w:bCs/>
-          <w:color w:val="595959" w:themeColor="text1" w:themeTint="A6"/>
-          <w:kern w:val="20"/>
-          <w:sz w:val="20"/>
-          <w:szCs w:val="20"/>
-        </w:rPr>
-        <w:t xml:space="preserve"> delivery:</w:t>
-      </w:r>
-      <w:r>
-        <w:rPr>
-          <w:rFonts w:eastAsiaTheme="minorHAnsi"/>
-          <w:color w:val="595959" w:themeColor="text1" w:themeTint="A6"/>
-          <w:kern w:val="20"/>
-          <w:sz w:val="20"/>
-          <w:szCs w:val="20"/>
-        </w:rPr>
-        <w:t xml:space="preserve"> d</w:t>
-      </w:r>
-      <w:r>
-        <w:rPr>
-          <w:rFonts w:eastAsiaTheme="minorHAnsi"/>
-          <w:color w:val="595959" w:themeColor="text1" w:themeTint="A6"/>
-          <w:kern w:val="20"/>
-          <w:sz w:val="20"/>
-          <w:szCs w:val="20"/>
-        </w:rPr>
-        <w:t>elivered client projects using Next.js, Angular, and TypeScript, with focus on scalability and SEO.</w:t>
+        <w:t>Built a full-featured CRM using Vue.js, delivering a scalable and maintainable system with a focus on performance and user experience.</w:t>
       </w:r>
     </w:p>
     <w:p>
@@ -1344,16 +1588,40 @@
           <w:sz w:val="20"/>
           <w:szCs w:val="20"/>
         </w:rPr>
-        <w:t>eam Collaboration:</w:t>
+        <w:t>ime</w:t>
       </w:r>
       <w:r>
         <w:rPr>
           <w:rFonts w:eastAsiaTheme="minorHAnsi"/>
+          <w:b/>
+          <w:bCs/>
           <w:color w:val="595959" w:themeColor="text1" w:themeTint="A6"/>
           <w:kern w:val="20"/>
           <w:sz w:val="20"/>
           <w:szCs w:val="20"/>
         </w:rPr>
+        <w:t>ly</w:t>
+      </w:r>
+      <w:r>
+        <w:rPr>
+          <w:rFonts w:eastAsiaTheme="minorHAnsi"/>
+          <w:b/>
+          <w:bCs/>
+          <w:color w:val="595959" w:themeColor="text1" w:themeTint="A6"/>
+          <w:kern w:val="20"/>
+          <w:sz w:val="20"/>
+          <w:szCs w:val="20"/>
+        </w:rPr>
+        <w:t xml:space="preserve"> delivery:</w:t>
+      </w:r>
+      <w:r>
+        <w:rPr>
+          <w:rFonts w:eastAsiaTheme="minorHAnsi"/>
+          <w:color w:val="595959" w:themeColor="text1" w:themeTint="A6"/>
+          <w:kern w:val="20"/>
+          <w:sz w:val="20"/>
+          <w:szCs w:val="20"/>
+        </w:rPr>
         <w:t xml:space="preserve"> </w:t>
       </w:r>
       <w:r>
@@ -1364,7 +1632,7 @@
           <w:sz w:val="20"/>
           <w:szCs w:val="20"/>
         </w:rPr>
-        <w:t>Worked closely with designers and backend teams to deliver pixel-perfect, responsive UIs.</w:t>
+        <w:t>delivered client projects using Next.js, Vue, Angular, and TypeScript, with focus on scalability and SEO.</w:t>
       </w:r>
     </w:p>
     <w:p>
@@ -1393,6 +1661,67 @@
           <w:sz w:val="20"/>
           <w:szCs w:val="20"/>
         </w:rPr>
+        <w:t>T</w:t>
+      </w:r>
+      <w:r>
+        <w:rPr>
+          <w:rFonts w:eastAsiaTheme="minorHAnsi"/>
+          <w:b/>
+          <w:bCs/>
+          <w:color w:val="595959" w:themeColor="text1" w:themeTint="A6"/>
+          <w:kern w:val="20"/>
+          <w:sz w:val="20"/>
+          <w:szCs w:val="20"/>
+        </w:rPr>
+        <w:t>eam Collaboration:</w:t>
+      </w:r>
+      <w:r>
+        <w:rPr>
+          <w:rFonts w:eastAsiaTheme="minorHAnsi"/>
+          <w:color w:val="595959" w:themeColor="text1" w:themeTint="A6"/>
+          <w:kern w:val="20"/>
+          <w:sz w:val="20"/>
+          <w:szCs w:val="20"/>
+        </w:rPr>
+        <w:t xml:space="preserve"> </w:t>
+      </w:r>
+      <w:r>
+        <w:rPr>
+          <w:rFonts w:eastAsiaTheme="minorHAnsi"/>
+          <w:color w:val="595959" w:themeColor="text1" w:themeTint="A6"/>
+          <w:kern w:val="20"/>
+          <w:sz w:val="20"/>
+          <w:szCs w:val="20"/>
+        </w:rPr>
+        <w:t>Worked closely with designers and backend teams to deliver pixel-perfect, responsive UIs.</w:t>
+      </w:r>
+    </w:p>
+    <w:p>
+      <w:pPr>
+        <w:numPr>
+          <w:ilvl w:val="0"/>
+          <w:numId w:val="1"/>
+        </w:numPr>
+        <w:spacing w:after="46"/>
+        <w:ind w:right="283"/>
+        <w:rPr>
+          <w:rFonts w:eastAsiaTheme="minorHAnsi"/>
+          <w:color w:val="595959" w:themeColor="text1" w:themeTint="A6"/>
+          <w:kern w:val="20"/>
+          <w:sz w:val="20"/>
+          <w:szCs w:val="20"/>
+        </w:rPr>
+      </w:pPr>
+      <w:r>
+        <w:rPr>
+          <w:rFonts w:eastAsiaTheme="minorHAnsi"/>
+          <w:b/>
+          <w:bCs/>
+          <w:color w:val="595959" w:themeColor="text1" w:themeTint="A6"/>
+          <w:kern w:val="20"/>
+          <w:sz w:val="20"/>
+          <w:szCs w:val="20"/>
+        </w:rPr>
         <w:t>Client Relations:</w:t>
       </w:r>
       <w:r>
@@ -1468,7 +1797,25 @@
           <w:color w:val="595959" w:themeColor="text1" w:themeTint="A6"/>
           <w:sz w:val="20"/>
         </w:rPr>
-        <w:t>HTML5, CSS3, SASS, Bootstrap, Tailwind, JavaScript, TypeScript, React, Redux, React Query, Angular, Next.js, Three.js, WebGL, Framer Motion, GSAP, Responsive Design (Flexbox, Grid, Media Queries), Accessibility (a11y) &amp; WCAG compliance, Performance Optimization (Lighthouse, Core Web Vitals), Server-Side Rendering (SSR) &amp; Static Site Generation (SSG), Internationalization (i18n), Progressive Web Apps (PWA), Authentication/Authorization (JWT, OAuth2), RESTful &amp; GraphQL API Design Principles, Storybook, Webpack, Vite, SWC, Babel</w:t>
+        <w:t>HTML5, CSS3, SASS, Bootstrap, Tailwind, JavaScript, TypeScript, React, Redux, React Query,</w:t>
+      </w:r>
+      <w:r>
+        <w:rPr>
+          <w:rFonts w:asciiTheme="minorHAnsi" w:eastAsiaTheme="minorHAnsi" w:hAnsiTheme="minorHAnsi" w:cstheme="minorBidi"/>
+          <w:caps w:val="0"/>
+          <w:color w:val="595959" w:themeColor="text1" w:themeTint="A6"/>
+          <w:sz w:val="20"/>
+        </w:rPr>
+        <w:t xml:space="preserve"> Vue,</w:t>
+      </w:r>
+      <w:r>
+        <w:rPr>
+          <w:rFonts w:asciiTheme="minorHAnsi" w:eastAsiaTheme="minorHAnsi" w:hAnsiTheme="minorHAnsi" w:cstheme="minorBidi"/>
+          <w:caps w:val="0"/>
+          <w:color w:val="595959" w:themeColor="text1" w:themeTint="A6"/>
+          <w:sz w:val="20"/>
+        </w:rPr>
+        <w:t xml:space="preserve"> Angular, Next.js, Three.js, WebGL, Framer Motion, GSAP, Responsive Design (Flexbox, Grid, Media Queries), Accessibility (a11y) &amp; WCAG compliance, Performance Optimization (Lighthouse, Core Web Vitals), Server-Side Rendering (SSR) &amp; Static Site Generation (SSG), Internationalization (i18n), Progressive Web Apps (PWA), Authentication/Authorization (JWT, OAuth2), RESTful &amp; GraphQL API Design Principles, Storybook, Webpack, Vite, SWC, Babel</w:t>
       </w:r>
     </w:p>
     <w:p>
@@ -1740,7 +2087,7 @@
 </file>
 
 <file path=word/endnotes.xml><?xml version="1.0" encoding="utf-8"?>
-<w:endnotes xmlns:wpc="http://schemas.microsoft.com/office/word/2010/wordprocessingCanvas" xmlns:cx="http://schemas.microsoft.com/office/drawing/2014/chartex" xmlns:cx1="http://schemas.microsoft.com/office/drawing/2015/9/8/chartex" xmlns:cx2="http://schemas.microsoft.com/office/drawing/2015/10/21/chartex" xmlns:cx3="http://schemas.microsoft.com/office/drawing/2016/5/9/chartex" xmlns:cx4="http://schemas.microsoft.com/office/drawing/2016/5/10/chartex" xmlns:cx5="http://schemas.microsoft.com/office/drawing/2016/5/11/chartex" xmlns:cx6="http://schemas.microsoft.com/office/drawing/2016/5/12/chartex" xmlns:cx7="http://schemas.microsoft.com/office/drawing/2016/5/13/chartex" xmlns:cx8="http://schemas.microsoft.com/office/drawing/2016/5/14/chartex" xmlns:mc="http://schemas.openxmlformats.org/markup-compatibility/2006" xmlns:aink="http://schemas.microsoft.com/office/drawing/2016/ink" xmlns:am3d="http://schemas.microsoft.com/office/drawing/2017/model3d" xmlns:o="urn:schemas-microsoft-com:office:office" xmlns:oel="http://schemas.microsoft.com/office/2019/extlst" xmlns:r="http://schemas.openxmlformats.org/officeDocument/2006/relationships" xmlns:m="http://schemas.openxmlformats.org/officeDocument/2006/math" xmlns:v="urn:schemas-microsoft-com:vml" xmlns:wp14="http://schemas.microsoft.com/office/word/2010/wordprocessingDrawing" xmlns:wp="http://schemas.openxmlformats.org/drawingml/2006/wordprocessingDrawing" xmlns:w10="urn:schemas-microsoft-com:office:word" xmlns:w="http://schemas.openxmlformats.org/wordprocessingml/2006/main" xmlns:w14="http://schemas.microsoft.com/office/word/2010/wordml" xmlns:w15="http://schemas.microsoft.com/office/word/2012/wordml" xmlns:w16cex="http://schemas.microsoft.com/office/word/2018/wordml/cex" xmlns:w16cid="http://schemas.microsoft.com/office/word/2016/wordml/cid" xmlns:w16="http://schemas.microsoft.com/office/word/2018/wordml" xmlns:w16du="http://schemas.microsoft.com/office/word/2023/wordml/word16du" xmlns:w16sdtdh="http://schemas.microsoft.com/office/word/2020/wordml/sdtdatahash" xmlns:w16sdtfl="http://schemas.microsoft.com/office/word/2024/wordml/sdtformatlock" xmlns:w16se="http://schemas.microsoft.com/office/word/2015/wordml/symex" xmlns:wpg="http://schemas.microsoft.com/office/word/2010/wordprocessingGroup" xmlns:wpi="http://schemas.microsoft.com/office/word/2010/wordprocessingInk" xmlns:wne="http://schemas.microsoft.com/office/word/2006/wordml" xmlns:wps="http://schemas.microsoft.com/office/word/2010/wordprocessingShape" mc:Ignorable="w14 w15 w16se w16cid w16 w16cex w16sdtdh w16sdtfl w16du wp14">
+<w:endnotes xmlns:wpc="http://schemas.microsoft.com/office/word/2010/wordprocessingCanvas" xmlns:cx="http://schemas.microsoft.com/office/drawing/2014/chartex" xmlns:cx1="http://schemas.microsoft.com/office/drawing/2015/9/8/chartex" xmlns:cx2="http://schemas.microsoft.com/office/drawing/2015/10/21/chartex" xmlns:cx3="http://schemas.microsoft.com/office/drawing/2016/5/9/chartex" xmlns:cx4="http://schemas.microsoft.com/office/drawing/2016/5/10/chartex" xmlns:cx5="http://schemas.microsoft.com/office/drawing/2016/5/11/chartex" xmlns:cx6="http://schemas.microsoft.com/office/drawing/2016/5/12/chartex" xmlns:cx7="http://schemas.microsoft.com/office/drawing/2016/5/13/chartex" xmlns:cx8="http://schemas.microsoft.com/office/drawing/2016/5/14/chartex" xmlns:mc="http://schemas.openxmlformats.org/markup-compatibility/2006" xmlns:m="http://schemas.openxmlformats.org/officeDocument/2006/math" xmlns:aink="http://schemas.microsoft.com/office/drawing/2016/ink" xmlns:am3d="http://schemas.microsoft.com/office/drawing/2017/model3d" xmlns:oel="http://schemas.microsoft.com/office/2019/extlst" xmlns:r="http://schemas.openxmlformats.org/officeDocument/2006/relationships" xmlns:wp14="http://schemas.microsoft.com/office/word/2010/wordprocessingDrawing" xmlns:wp="http://schemas.openxmlformats.org/drawingml/2006/wordprocessingDrawing" xmlns:wpg="http://schemas.microsoft.com/office/word/2010/wordprocessingGroup" xmlns:wpi="http://schemas.microsoft.com/office/word/2010/wordprocessingInk" xmlns:wps="http://schemas.microsoft.com/office/word/2010/wordprocessingShape" xmlns:o="urn:schemas-microsoft-com:office:office" xmlns:v="urn:schemas-microsoft-com:vml" xmlns:w10="urn:schemas-microsoft-com:office:word" xmlns:w="http://schemas.openxmlformats.org/wordprocessingml/2006/main" xmlns:w14="http://schemas.microsoft.com/office/word/2010/wordml" xmlns:w15="http://schemas.microsoft.com/office/word/2012/wordml" xmlns:w16cei="http://schemas.microsoft.com/office/word/2026/wordml/cei" xmlns:w16cex="http://schemas.microsoft.com/office/word/2018/wordml/cex" xmlns:w16cid="http://schemas.microsoft.com/office/word/2016/wordml/cid" xmlns:w16="http://schemas.microsoft.com/office/word/2018/wordml" xmlns:w16sdtdh="http://schemas.microsoft.com/office/word/2020/wordml/sdtdatahash" xmlns:w16sdtfl="http://schemas.microsoft.com/office/word/2024/wordml/sdtformatlock" xmlns:w16se="http://schemas.microsoft.com/office/word/2015/wordml/symex" xmlns:w16du="http://schemas.microsoft.com/office/word/2023/wordml/word16du" xmlns:wne="http://schemas.microsoft.com/office/word/2006/wordml" mc:Ignorable="w14 w15 w16se w16cid w16 w16cex w16sdtdh w16sdtfl w16du wp14">
   <w:endnote w:type="separator" w:id="-1">
     <w:p>
       <w:pPr>
@@ -1765,7 +2112,7 @@
 </file>
 
 <file path=word/footer1.xml><?xml version="1.0" encoding="utf-8"?>
-<w:ftr xmlns:wpc="http://schemas.microsoft.com/office/word/2010/wordprocessingCanvas" xmlns:cx="http://schemas.microsoft.com/office/drawing/2014/chartex" xmlns:cx1="http://schemas.microsoft.com/office/drawing/2015/9/8/chartex" xmlns:cx2="http://schemas.microsoft.com/office/drawing/2015/10/21/chartex" xmlns:cx3="http://schemas.microsoft.com/office/drawing/2016/5/9/chartex" xmlns:cx4="http://schemas.microsoft.com/office/drawing/2016/5/10/chartex" xmlns:cx5="http://schemas.microsoft.com/office/drawing/2016/5/11/chartex" xmlns:cx6="http://schemas.microsoft.com/office/drawing/2016/5/12/chartex" xmlns:cx7="http://schemas.microsoft.com/office/drawing/2016/5/13/chartex" xmlns:cx8="http://schemas.microsoft.com/office/drawing/2016/5/14/chartex" xmlns:mc="http://schemas.openxmlformats.org/markup-compatibility/2006" xmlns:aink="http://schemas.microsoft.com/office/drawing/2016/ink" xmlns:am3d="http://schemas.microsoft.com/office/drawing/2017/model3d" xmlns:o="urn:schemas-microsoft-com:office:office" xmlns:oel="http://schemas.microsoft.com/office/2019/extlst" xmlns:r="http://schemas.openxmlformats.org/officeDocument/2006/relationships" xmlns:m="http://schemas.openxmlformats.org/officeDocument/2006/math" xmlns:v="urn:schemas-microsoft-com:vml" xmlns:wp14="http://schemas.microsoft.com/office/word/2010/wordprocessingDrawing" xmlns:wp="http://schemas.openxmlformats.org/drawingml/2006/wordprocessingDrawing" xmlns:w10="urn:schemas-microsoft-com:office:word" xmlns:w="http://schemas.openxmlformats.org/wordprocessingml/2006/main" xmlns:w14="http://schemas.microsoft.com/office/word/2010/wordml" xmlns:w15="http://schemas.microsoft.com/office/word/2012/wordml" xmlns:w16cex="http://schemas.microsoft.com/office/word/2018/wordml/cex" xmlns:w16cid="http://schemas.microsoft.com/office/word/2016/wordml/cid" xmlns:w16="http://schemas.microsoft.com/office/word/2018/wordml" xmlns:w16du="http://schemas.microsoft.com/office/word/2023/wordml/word16du" xmlns:w16sdtdh="http://schemas.microsoft.com/office/word/2020/wordml/sdtdatahash" xmlns:w16sdtfl="http://schemas.microsoft.com/office/word/2024/wordml/sdtformatlock" xmlns:w16se="http://schemas.microsoft.com/office/word/2015/wordml/symex" xmlns:wpg="http://schemas.microsoft.com/office/word/2010/wordprocessingGroup" xmlns:wpi="http://schemas.microsoft.com/office/word/2010/wordprocessingInk" xmlns:wne="http://schemas.microsoft.com/office/word/2006/wordml" xmlns:wps="http://schemas.microsoft.com/office/word/2010/wordprocessingShape" mc:Ignorable="w14 w15 w16se w16cid w16 w16cex w16sdtdh w16sdtfl w16du wp14">
+<w:ftr xmlns:wpc="http://schemas.microsoft.com/office/word/2010/wordprocessingCanvas" xmlns:cx="http://schemas.microsoft.com/office/drawing/2014/chartex" xmlns:cx1="http://schemas.microsoft.com/office/drawing/2015/9/8/chartex" xmlns:cx2="http://schemas.microsoft.com/office/drawing/2015/10/21/chartex" xmlns:cx3="http://schemas.microsoft.com/office/drawing/2016/5/9/chartex" xmlns:cx4="http://schemas.microsoft.com/office/drawing/2016/5/10/chartex" xmlns:cx5="http://schemas.microsoft.com/office/drawing/2016/5/11/chartex" xmlns:cx6="http://schemas.microsoft.com/office/drawing/2016/5/12/chartex" xmlns:cx7="http://schemas.microsoft.com/office/drawing/2016/5/13/chartex" xmlns:cx8="http://schemas.microsoft.com/office/drawing/2016/5/14/chartex" xmlns:mc="http://schemas.openxmlformats.org/markup-compatibility/2006" xmlns:m="http://schemas.openxmlformats.org/officeDocument/2006/math" xmlns:aink="http://schemas.microsoft.com/office/drawing/2016/ink" xmlns:am3d="http://schemas.microsoft.com/office/drawing/2017/model3d" xmlns:oel="http://schemas.microsoft.com/office/2019/extlst" xmlns:r="http://schemas.openxmlformats.org/officeDocument/2006/relationships" xmlns:wp14="http://schemas.microsoft.com/office/word/2010/wordprocessingDrawing" xmlns:wp="http://schemas.openxmlformats.org/drawingml/2006/wordprocessingDrawing" xmlns:wpg="http://schemas.microsoft.com/office/word/2010/wordprocessingGroup" xmlns:wpi="http://schemas.microsoft.com/office/word/2010/wordprocessingInk" xmlns:wps="http://schemas.microsoft.com/office/word/2010/wordprocessingShape" xmlns:o="urn:schemas-microsoft-com:office:office" xmlns:v="urn:schemas-microsoft-com:vml" xmlns:w10="urn:schemas-microsoft-com:office:word" xmlns:w="http://schemas.openxmlformats.org/wordprocessingml/2006/main" xmlns:w14="http://schemas.microsoft.com/office/word/2010/wordml" xmlns:w15="http://schemas.microsoft.com/office/word/2012/wordml" xmlns:w16cei="http://schemas.microsoft.com/office/word/2026/wordml/cei" xmlns:w16cex="http://schemas.microsoft.com/office/word/2018/wordml/cex" xmlns:w16cid="http://schemas.microsoft.com/office/word/2016/wordml/cid" xmlns:w16="http://schemas.microsoft.com/office/word/2018/wordml" xmlns:w16sdtdh="http://schemas.microsoft.com/office/word/2020/wordml/sdtdatahash" xmlns:w16sdtfl="http://schemas.microsoft.com/office/word/2024/wordml/sdtformatlock" xmlns:w16se="http://schemas.microsoft.com/office/word/2015/wordml/symex" xmlns:w16du="http://schemas.microsoft.com/office/word/2023/wordml/word16du" xmlns:wne="http://schemas.microsoft.com/office/word/2006/wordml" mc:Ignorable="w14 w15 w16se w16cid w16 w16cex w16sdtdh w16sdtfl w16du wp14">
   <w:p>
     <w:pPr>
       <w:pStyle w:val="Footer"/>
@@ -1796,7 +2143,7 @@
 </file>
 
 <file path=word/footnotes.xml><?xml version="1.0" encoding="utf-8"?>
-<w:footnotes xmlns:wpc="http://schemas.microsoft.com/office/word/2010/wordprocessingCanvas" xmlns:cx="http://schemas.microsoft.com/office/drawing/2014/chartex" xmlns:cx1="http://schemas.microsoft.com/office/drawing/2015/9/8/chartex" xmlns:cx2="http://schemas.microsoft.com/office/drawing/2015/10/21/chartex" xmlns:cx3="http://schemas.microsoft.com/office/drawing/2016/5/9/chartex" xmlns:cx4="http://schemas.microsoft.com/office/drawing/2016/5/10/chartex" xmlns:cx5="http://schemas.microsoft.com/office/drawing/2016/5/11/chartex" xmlns:cx6="http://schemas.microsoft.com/office/drawing/2016/5/12/chartex" xmlns:cx7="http://schemas.microsoft.com/office/drawing/2016/5/13/chartex" xmlns:cx8="http://schemas.microsoft.com/office/drawing/2016/5/14/chartex" xmlns:mc="http://schemas.openxmlformats.org/markup-compatibility/2006" xmlns:aink="http://schemas.microsoft.com/office/drawing/2016/ink" xmlns:am3d="http://schemas.microsoft.com/office/drawing/2017/model3d" xmlns:o="urn:schemas-microsoft-com:office:office" xmlns:oel="http://schemas.microsoft.com/office/2019/extlst" xmlns:r="http://schemas.openxmlformats.org/officeDocument/2006/relationships" xmlns:m="http://schemas.openxmlformats.org/officeDocument/2006/math" xmlns:v="urn:schemas-microsoft-com:vml" xmlns:wp14="http://schemas.microsoft.com/office/word/2010/wordprocessingDrawing" xmlns:wp="http://schemas.openxmlformats.org/drawingml/2006/wordprocessingDrawing" xmlns:w10="urn:schemas-microsoft-com:office:word" xmlns:w="http://schemas.openxmlformats.org/wordprocessingml/2006/main" xmlns:w14="http://schemas.microsoft.com/office/word/2010/wordml" xmlns:w15="http://schemas.microsoft.com/office/word/2012/wordml" xmlns:w16cex="http://schemas.microsoft.com/office/word/2018/wordml/cex" xmlns:w16cid="http://schemas.microsoft.com/office/word/2016/wordml/cid" xmlns:w16="http://schemas.microsoft.com/office/word/2018/wordml" xmlns:w16du="http://schemas.microsoft.com/office/word/2023/wordml/word16du" xmlns:w16sdtdh="http://schemas.microsoft.com/office/word/2020/wordml/sdtdatahash" xmlns:w16sdtfl="http://schemas.microsoft.com/office/word/2024/wordml/sdtformatlock" xmlns:w16se="http://schemas.microsoft.com/office/word/2015/wordml/symex" xmlns:wpg="http://schemas.microsoft.com/office/word/2010/wordprocessingGroup" xmlns:wpi="http://schemas.microsoft.com/office/word/2010/wordprocessingInk" xmlns:wne="http://schemas.microsoft.com/office/word/2006/wordml" xmlns:wps="http://schemas.microsoft.com/office/word/2010/wordprocessingShape" mc:Ignorable="w14 w15 w16se w16cid w16 w16cex w16sdtdh w16sdtfl w16du wp14">
+<w:footnotes xmlns:wpc="http://schemas.microsoft.com/office/word/2010/wordprocessingCanvas" xmlns:cx="http://schemas.microsoft.com/office/drawing/2014/chartex" xmlns:cx1="http://schemas.microsoft.com/office/drawing/2015/9/8/chartex" xmlns:cx2="http://schemas.microsoft.com/office/drawing/2015/10/21/chartex" xmlns:cx3="http://schemas.microsoft.com/office/drawing/2016/5/9/chartex" xmlns:cx4="http://schemas.microsoft.com/office/drawing/2016/5/10/chartex" xmlns:cx5="http://schemas.microsoft.com/office/drawing/2016/5/11/chartex" xmlns:cx6="http://schemas.microsoft.com/office/drawing/2016/5/12/chartex" xmlns:cx7="http://schemas.microsoft.com/office/drawing/2016/5/13/chartex" xmlns:cx8="http://schemas.microsoft.com/office/drawing/2016/5/14/chartex" xmlns:mc="http://schemas.openxmlformats.org/markup-compatibility/2006" xmlns:m="http://schemas.openxmlformats.org/officeDocument/2006/math" xmlns:aink="http://schemas.microsoft.com/office/drawing/2016/ink" xmlns:am3d="http://schemas.microsoft.com/office/drawing/2017/model3d" xmlns:oel="http://schemas.microsoft.com/office/2019/extlst" xmlns:r="http://schemas.openxmlformats.org/officeDocument/2006/relationships" xmlns:wp14="http://schemas.microsoft.com/office/word/2010/wordprocessingDrawing" xmlns:wp="http://schemas.openxmlformats.org/drawingml/2006/wordprocessingDrawing" xmlns:wpg="http://schemas.microsoft.com/office/word/2010/wordprocessingGroup" xmlns:wpi="http://schemas.microsoft.com/office/word/2010/wordprocessingInk" xmlns:wps="http://schemas.microsoft.com/office/word/2010/wordprocessingShape" xmlns:o="urn:schemas-microsoft-com:office:office" xmlns:v="urn:schemas-microsoft-com:vml" xmlns:w10="urn:schemas-microsoft-com:office:word" xmlns:w="http://schemas.openxmlformats.org/wordprocessingml/2006/main" xmlns:w14="http://schemas.microsoft.com/office/word/2010/wordml" xmlns:w15="http://schemas.microsoft.com/office/word/2012/wordml" xmlns:w16cei="http://schemas.microsoft.com/office/word/2026/wordml/cei" xmlns:w16cex="http://schemas.microsoft.com/office/word/2018/wordml/cex" xmlns:w16cid="http://schemas.microsoft.com/office/word/2016/wordml/cid" xmlns:w16="http://schemas.microsoft.com/office/word/2018/wordml" xmlns:w16sdtdh="http://schemas.microsoft.com/office/word/2020/wordml/sdtdatahash" xmlns:w16sdtfl="http://schemas.microsoft.com/office/word/2024/wordml/sdtformatlock" xmlns:w16se="http://schemas.microsoft.com/office/word/2015/wordml/symex" xmlns:w16du="http://schemas.microsoft.com/office/word/2023/wordml/word16du" xmlns:wne="http://schemas.microsoft.com/office/word/2006/wordml" mc:Ignorable="w14 w15 w16se w16cid w16 w16cex w16sdtdh w16sdtfl w16du wp14">
   <w:footnote w:type="separator" w:id="-1">
     <w:p>
       <w:pPr>
@@ -1821,7 +2168,7 @@
 </file>
 
 <file path=word/numbering.xml><?xml version="1.0" encoding="utf-8"?>
-<w:numbering xmlns:wpc="http://schemas.microsoft.com/office/word/2010/wordprocessingCanvas" xmlns:cx="http://schemas.microsoft.com/office/drawing/2014/chartex" xmlns:cx1="http://schemas.microsoft.com/office/drawing/2015/9/8/chartex" xmlns:cx2="http://schemas.microsoft.com/office/drawing/2015/10/21/chartex" xmlns:cx3="http://schemas.microsoft.com/office/drawing/2016/5/9/chartex" xmlns:cx4="http://schemas.microsoft.com/office/drawing/2016/5/10/chartex" xmlns:cx5="http://schemas.microsoft.com/office/drawing/2016/5/11/chartex" xmlns:cx6="http://schemas.microsoft.com/office/drawing/2016/5/12/chartex" xmlns:cx7="http://schemas.microsoft.com/office/drawing/2016/5/13/chartex" xmlns:cx8="http://schemas.microsoft.com/office/drawing/2016/5/14/chartex" xmlns:mc="http://schemas.openxmlformats.org/markup-compatibility/2006" xmlns:aink="http://schemas.microsoft.com/office/drawing/2016/ink" xmlns:am3d="http://schemas.microsoft.com/office/drawing/2017/model3d" xmlns:o="urn:schemas-microsoft-com:office:office" xmlns:oel="http://schemas.microsoft.com/office/2019/extlst" xmlns:r="http://schemas.openxmlformats.org/officeDocument/2006/relationships" xmlns:m="http://schemas.openxmlformats.org/officeDocument/2006/math" xmlns:v="urn:schemas-microsoft-com:vml" xmlns:wp14="http://schemas.microsoft.com/office/word/2010/wordprocessingDrawing" xmlns:wp="http://schemas.openxmlformats.org/drawingml/2006/wordprocessingDrawing" xmlns:w10="urn:schemas-microsoft-com:office:word" xmlns:w="http://schemas.openxmlformats.org/wordprocessingml/2006/main" xmlns:w14="http://schemas.microsoft.com/office/word/2010/wordml" xmlns:w15="http://schemas.microsoft.com/office/word/2012/wordml" xmlns:w16cex="http://schemas.microsoft.com/office/word/2018/wordml/cex" xmlns:w16cid="http://schemas.microsoft.com/office/word/2016/wordml/cid" xmlns:w16="http://schemas.microsoft.com/office/word/2018/wordml" xmlns:w16du="http://schemas.microsoft.com/office/word/2023/wordml/word16du" xmlns:w16sdtdh="http://schemas.microsoft.com/office/word/2020/wordml/sdtdatahash" xmlns:w16sdtfl="http://schemas.microsoft.com/office/word/2024/wordml/sdtformatlock" xmlns:w16se="http://schemas.microsoft.com/office/word/2015/wordml/symex" xmlns:wpg="http://schemas.microsoft.com/office/word/2010/wordprocessingGroup" xmlns:wpi="http://schemas.microsoft.com/office/word/2010/wordprocessingInk" xmlns:wne="http://schemas.microsoft.com/office/word/2006/wordml" xmlns:wps="http://schemas.microsoft.com/office/word/2010/wordprocessingShape" mc:Ignorable="w14 w15 w16se w16cid w16 w16cex w16sdtdh w16sdtfl w16du wp14">
+<w:numbering xmlns:wpc="http://schemas.microsoft.com/office/word/2010/wordprocessingCanvas" xmlns:cx="http://schemas.microsoft.com/office/drawing/2014/chartex" xmlns:cx1="http://schemas.microsoft.com/office/drawing/2015/9/8/chartex" xmlns:cx2="http://schemas.microsoft.com/office/drawing/2015/10/21/chartex" xmlns:cx3="http://schemas.microsoft.com/office/drawing/2016/5/9/chartex" xmlns:cx4="http://schemas.microsoft.com/office/drawing/2016/5/10/chartex" xmlns:cx5="http://schemas.microsoft.com/office/drawing/2016/5/11/chartex" xmlns:cx6="http://schemas.microsoft.com/office/drawing/2016/5/12/chartex" xmlns:cx7="http://schemas.microsoft.com/office/drawing/2016/5/13/chartex" xmlns:cx8="http://schemas.microsoft.com/office/drawing/2016/5/14/chartex" xmlns:mc="http://schemas.openxmlformats.org/markup-compatibility/2006" xmlns:m="http://schemas.openxmlformats.org/officeDocument/2006/math" xmlns:aink="http://schemas.microsoft.com/office/drawing/2016/ink" xmlns:am3d="http://schemas.microsoft.com/office/drawing/2017/model3d" xmlns:oel="http://schemas.microsoft.com/office/2019/extlst" xmlns:r="http://schemas.openxmlformats.org/officeDocument/2006/relationships" xmlns:wp14="http://schemas.microsoft.com/office/word/2010/wordprocessingDrawing" xmlns:wp="http://schemas.openxmlformats.org/drawingml/2006/wordprocessingDrawing" xmlns:wpg="http://schemas.microsoft.com/office/word/2010/wordprocessingGroup" xmlns:wpi="http://schemas.microsoft.com/office/word/2010/wordprocessingInk" xmlns:wps="http://schemas.microsoft.com/office/word/2010/wordprocessingShape" xmlns:o="urn:schemas-microsoft-com:office:office" xmlns:v="urn:schemas-microsoft-com:vml" xmlns:w10="urn:schemas-microsoft-com:office:word" xmlns:w="http://schemas.openxmlformats.org/wordprocessingml/2006/main" xmlns:w14="http://schemas.microsoft.com/office/word/2010/wordml" xmlns:w15="http://schemas.microsoft.com/office/word/2012/wordml" xmlns:w16cei="http://schemas.microsoft.com/office/word/2026/wordml/cei" xmlns:w16cex="http://schemas.microsoft.com/office/word/2018/wordml/cex" xmlns:w16cid="http://schemas.microsoft.com/office/word/2016/wordml/cid" xmlns:w16="http://schemas.microsoft.com/office/word/2018/wordml" xmlns:w16sdtdh="http://schemas.microsoft.com/office/word/2020/wordml/sdtdatahash" xmlns:w16sdtfl="http://schemas.microsoft.com/office/word/2024/wordml/sdtformatlock" xmlns:w16se="http://schemas.microsoft.com/office/word/2015/wordml/symex" xmlns:w16du="http://schemas.microsoft.com/office/word/2023/wordml/word16du" xmlns:wne="http://schemas.microsoft.com/office/word/2006/wordml" mc:Ignorable="w14 w15 w16se w16cid w16 w16cex w16sdtdh w16sdtfl w16du wp14">
   <w:abstractNum w:abstractNumId="0" w15:restartNumberingAfterBreak="0">
     <w:nsid w:val="01971FBC"/>
     <w:multiLevelType w:val="hybridMultilevel"/>
@@ -2763,6 +3110,155 @@
     </w:lvl>
   </w:abstractNum>
   <w:abstractNum w:abstractNumId="8" w15:restartNumberingAfterBreak="0">
+    <w:nsid w:val="48116DC5"/>
+    <w:multiLevelType w:val="multilevel"/>
+    <w:tmpl w:val="000C3364"/>
+    <w:lvl w:ilvl="0">
+      <w:start w:val="1"/>
+      <w:numFmt w:val="bullet"/>
+      <w:lvlText w:val=""/>
+      <w:lvlJc w:val="left"/>
+      <w:pPr>
+        <w:tabs>
+          <w:tab w:val="num" w:pos="720"/>
+        </w:tabs>
+        <w:ind w:left="720" w:hanging="360"/>
+      </w:pPr>
+      <w:rPr>
+        <w:rFonts w:ascii="Symbol" w:hAnsi="Symbol" w:hint="default"/>
+        <w:sz w:val="20"/>
+      </w:rPr>
+    </w:lvl>
+    <w:lvl w:ilvl="1" w:tentative="1">
+      <w:start w:val="1"/>
+      <w:numFmt w:val="bullet"/>
+      <w:lvlText w:val="o"/>
+      <w:lvlJc w:val="left"/>
+      <w:pPr>
+        <w:tabs>
+          <w:tab w:val="num" w:pos="1440"/>
+        </w:tabs>
+        <w:ind w:left="1440" w:hanging="360"/>
+      </w:pPr>
+      <w:rPr>
+        <w:rFonts w:ascii="Courier New" w:hAnsi="Courier New" w:hint="default"/>
+        <w:sz w:val="20"/>
+      </w:rPr>
+    </w:lvl>
+    <w:lvl w:ilvl="2" w:tentative="1">
+      <w:start w:val="1"/>
+      <w:numFmt w:val="bullet"/>
+      <w:lvlText w:val=""/>
+      <w:lvlJc w:val="left"/>
+      <w:pPr>
+        <w:tabs>
+          <w:tab w:val="num" w:pos="2160"/>
+        </w:tabs>
+        <w:ind w:left="2160" w:hanging="360"/>
+      </w:pPr>
+      <w:rPr>
+        <w:rFonts w:ascii="Wingdings" w:hAnsi="Wingdings" w:hint="default"/>
+        <w:sz w:val="20"/>
+      </w:rPr>
+    </w:lvl>
+    <w:lvl w:ilvl="3" w:tentative="1">
+      <w:start w:val="1"/>
+      <w:numFmt w:val="bullet"/>
+      <w:lvlText w:val=""/>
+      <w:lvlJc w:val="left"/>
+      <w:pPr>
+        <w:tabs>
+          <w:tab w:val="num" w:pos="2880"/>
+        </w:tabs>
+        <w:ind w:left="2880" w:hanging="360"/>
+      </w:pPr>
+      <w:rPr>
+        <w:rFonts w:ascii="Wingdings" w:hAnsi="Wingdings" w:hint="default"/>
+        <w:sz w:val="20"/>
+      </w:rPr>
+    </w:lvl>
+    <w:lvl w:ilvl="4" w:tentative="1">
+      <w:start w:val="1"/>
+      <w:numFmt w:val="bullet"/>
+      <w:lvlText w:val=""/>
+      <w:lvlJc w:val="left"/>
+      <w:pPr>
+        <w:tabs>
+          <w:tab w:val="num" w:pos="3600"/>
+        </w:tabs>
+        <w:ind w:left="3600" w:hanging="360"/>
+      </w:pPr>
+      <w:rPr>
+        <w:rFonts w:ascii="Wingdings" w:hAnsi="Wingdings" w:hint="default"/>
+        <w:sz w:val="20"/>
+      </w:rPr>
+    </w:lvl>
+    <w:lvl w:ilvl="5" w:tentative="1">
+      <w:start w:val="1"/>
+      <w:numFmt w:val="bullet"/>
+      <w:lvlText w:val=""/>
+      <w:lvlJc w:val="left"/>
+      <w:pPr>
+        <w:tabs>
+          <w:tab w:val="num" w:pos="4320"/>
+        </w:tabs>
+        <w:ind w:left="4320" w:hanging="360"/>
+      </w:pPr>
+      <w:rPr>
+        <w:rFonts w:ascii="Wingdings" w:hAnsi="Wingdings" w:hint="default"/>
+        <w:sz w:val="20"/>
+      </w:rPr>
+    </w:lvl>
+    <w:lvl w:ilvl="6" w:tentative="1">
+      <w:start w:val="1"/>
+      <w:numFmt w:val="bullet"/>
+      <w:lvlText w:val=""/>
+      <w:lvlJc w:val="left"/>
+      <w:pPr>
+        <w:tabs>
+          <w:tab w:val="num" w:pos="5040"/>
+        </w:tabs>
+        <w:ind w:left="5040" w:hanging="360"/>
+      </w:pPr>
+      <w:rPr>
+        <w:rFonts w:ascii="Wingdings" w:hAnsi="Wingdings" w:hint="default"/>
+        <w:sz w:val="20"/>
+      </w:rPr>
+    </w:lvl>
+    <w:lvl w:ilvl="7" w:tentative="1">
+      <w:start w:val="1"/>
+      <w:numFmt w:val="bullet"/>
+      <w:lvlText w:val=""/>
+      <w:lvlJc w:val="left"/>
+      <w:pPr>
+        <w:tabs>
+          <w:tab w:val="num" w:pos="5760"/>
+        </w:tabs>
+        <w:ind w:left="5760" w:hanging="360"/>
+      </w:pPr>
+      <w:rPr>
+        <w:rFonts w:ascii="Wingdings" w:hAnsi="Wingdings" w:hint="default"/>
+        <w:sz w:val="20"/>
+      </w:rPr>
+    </w:lvl>
+    <w:lvl w:ilvl="8" w:tentative="1">
+      <w:start w:val="1"/>
+      <w:numFmt w:val="bullet"/>
+      <w:lvlText w:val=""/>
+      <w:lvlJc w:val="left"/>
+      <w:pPr>
+        <w:tabs>
+          <w:tab w:val="num" w:pos="6480"/>
+        </w:tabs>
+        <w:ind w:left="6480" w:hanging="360"/>
+      </w:pPr>
+      <w:rPr>
+        <w:rFonts w:ascii="Wingdings" w:hAnsi="Wingdings" w:hint="default"/>
+        <w:sz w:val="20"/>
+      </w:rPr>
+    </w:lvl>
+  </w:abstractNum>
+  <w:abstractNum w:abstractNumId="9" w15:restartNumberingAfterBreak="0">
     <w:nsid w:val="62DB31C8"/>
     <w:multiLevelType w:val="hybridMultilevel"/>
     <w:tmpl w:val="1284B52C"/>
@@ -2875,7 +3371,7 @@
       </w:rPr>
     </w:lvl>
   </w:abstractNum>
-  <w:abstractNum w:abstractNumId="9" w15:restartNumberingAfterBreak="0">
+  <w:abstractNum w:abstractNumId="10" w15:restartNumberingAfterBreak="0">
     <w:nsid w:val="645E2AFD"/>
     <w:multiLevelType w:val="hybridMultilevel"/>
     <w:tmpl w:val="29D2A988"/>
@@ -2989,7 +3485,7 @@
       </w:rPr>
     </w:lvl>
   </w:abstractNum>
-  <w:abstractNum w:abstractNumId="10" w15:restartNumberingAfterBreak="0">
+  <w:abstractNum w:abstractNumId="11" w15:restartNumberingAfterBreak="0">
     <w:nsid w:val="67F91B43"/>
     <w:multiLevelType w:val="hybridMultilevel"/>
     <w:tmpl w:val="193C97DA"/>
@@ -3102,7 +3598,7 @@
       </w:rPr>
     </w:lvl>
   </w:abstractNum>
-  <w:abstractNum w:abstractNumId="11" w15:restartNumberingAfterBreak="0">
+  <w:abstractNum w:abstractNumId="12" w15:restartNumberingAfterBreak="0">
     <w:nsid w:val="695F3FE9"/>
     <w:multiLevelType w:val="multilevel"/>
     <w:tmpl w:val="140A319A"/>
@@ -3252,16 +3748,16 @@
     </w:lvl>
   </w:abstractNum>
   <w:num w:numId="1" w16cid:durableId="1968579325">
-    <w:abstractNumId w:val="9"/>
+    <w:abstractNumId w:val="10"/>
   </w:num>
   <w:num w:numId="2" w16cid:durableId="405691740">
-    <w:abstractNumId w:val="11"/>
+    <w:abstractNumId w:val="12"/>
   </w:num>
   <w:num w:numId="3" w16cid:durableId="1911767264">
     <w:abstractNumId w:val="5"/>
   </w:num>
   <w:num w:numId="4" w16cid:durableId="101996582">
-    <w:abstractNumId w:val="8"/>
+    <w:abstractNumId w:val="9"/>
   </w:num>
   <w:num w:numId="5" w16cid:durableId="1441681647">
     <w:abstractNumId w:val="2"/>
@@ -3273,7 +3769,7 @@
     <w:abstractNumId w:val="6"/>
   </w:num>
   <w:num w:numId="8" w16cid:durableId="308176104">
-    <w:abstractNumId w:val="10"/>
+    <w:abstractNumId w:val="11"/>
   </w:num>
   <w:num w:numId="9" w16cid:durableId="298876392">
     <w:abstractNumId w:val="7"/>
@@ -3287,11 +3783,14 @@
   <w:num w:numId="12" w16cid:durableId="909583402">
     <w:abstractNumId w:val="3"/>
   </w:num>
+  <w:num w:numId="13" w16cid:durableId="1907836118">
+    <w:abstractNumId w:val="8"/>
+  </w:num>
 </w:numbering>
 </file>
 
 <file path=word/styles.xml><?xml version="1.0" encoding="utf-8"?>
-<w:styles xmlns:mc="http://schemas.openxmlformats.org/markup-compatibility/2006" xmlns:r="http://schemas.openxmlformats.org/officeDocument/2006/relationships" xmlns:w="http://schemas.openxmlformats.org/wordprocessingml/2006/main" xmlns:w14="http://schemas.microsoft.com/office/word/2010/wordml" xmlns:w15="http://schemas.microsoft.com/office/word/2012/wordml" xmlns:w16cex="http://schemas.microsoft.com/office/word/2018/wordml/cex" xmlns:w16cid="http://schemas.microsoft.com/office/word/2016/wordml/cid" xmlns:w16="http://schemas.microsoft.com/office/word/2018/wordml" xmlns:w16du="http://schemas.microsoft.com/office/word/2023/wordml/word16du" xmlns:w16sdtdh="http://schemas.microsoft.com/office/word/2020/wordml/sdtdatahash" xmlns:w16sdtfl="http://schemas.microsoft.com/office/word/2024/wordml/sdtformatlock" xmlns:w16se="http://schemas.microsoft.com/office/word/2015/wordml/symex" mc:Ignorable="w14 w15 w16se w16cid w16 w16cex w16sdtdh w16sdtfl w16du">
+<w:styles xmlns:mc="http://schemas.openxmlformats.org/markup-compatibility/2006" xmlns:r="http://schemas.openxmlformats.org/officeDocument/2006/relationships" xmlns:w="http://schemas.openxmlformats.org/wordprocessingml/2006/main" xmlns:w14="http://schemas.microsoft.com/office/word/2010/wordml" xmlns:w15="http://schemas.microsoft.com/office/word/2012/wordml" xmlns:w16cex="http://schemas.microsoft.com/office/word/2018/wordml/cex" xmlns:w16cid="http://schemas.microsoft.com/office/word/2016/wordml/cid" xmlns:w16="http://schemas.microsoft.com/office/word/2018/wordml" xmlns:w16sdtdh="http://schemas.microsoft.com/office/word/2020/wordml/sdtdatahash" xmlns:w16sdtfl="http://schemas.microsoft.com/office/word/2024/wordml/sdtformatlock" xmlns:w16se="http://schemas.microsoft.com/office/word/2015/wordml/symex" xmlns:w16du="http://schemas.microsoft.com/office/word/2023/wordml/word16du" mc:Ignorable="w14 w15 w16se w16cid w16 w16cex w16sdtdh w16sdtfl w16du">
   <w:docDefaults>
     <w:rPrDefault>
       <w:rPr>
@@ -3894,7 +4393,6 @@
   <w:style w:type="character" w:default="1" w:styleId="DefaultParagraphFont">
     <w:name w:val="Default Paragraph Font"/>
     <w:uiPriority w:val="1"/>
-    <w:semiHidden/>
     <w:unhideWhenUsed/>
   </w:style>
   <w:style w:type="table" w:default="1" w:styleId="TableNormal">

</xml_diff>